<commit_message>
Complete Labs 6-7 acceptance hardening
</commit_message>
<xml_diff>
--- a/deliverables/ЛР-6_ПМСС_Гончаров_Вадим_ОІ-43.docx
+++ b/deliverables/ЛР-6_ПМСС_Гончаров_Вадим_ОІ-43.docx
@@ -192,6 +192,7 @@
     </w:p>
     <w:tbl>
       <w:tblPr>
+        <w:tblStyle w:val="TableGrid"/>
         <w:tblW w:type="auto" w:w="0"/>
         <w:jc w:val="center"/>
         <w:tblLook w:firstColumn="1" w:firstRow="1" w:lastColumn="0" w:lastRow="0" w:noHBand="0" w:noVBand="1" w:val="04A0"/>
@@ -209,19 +210,26 @@
         <w:gridCol w:w="4677"/>
       </w:tblGrid>
       <w:tr>
+        <w:trPr>
+          <w:tblHeader/>
+        </w:trPr>
         <w:tc>
           <w:tcPr>
             <w:tcW w:type="dxa" w:w="2835"/>
             <w:shd w:fill="1F4E78"/>
             <w:vAlign w:val="center"/>
+            <w:shd w:fill="1F4E78"/>
           </w:tcPr>
           <w:p>
+            <w:pPr>
+              <w:spacing w:after="40"/>
+            </w:pPr>
             <w:r>
               <w:rPr>
-                <w:rFonts w:ascii="Times New Roman" w:hAnsi="Times New Roman" w:eastAsia="Times New Roman"/>
+                <w:rFonts w:ascii="Arial" w:hAnsi="Arial" w:eastAsia="Times New Roman"/>
                 <w:b/>
                 <w:color w:val="FFFFFF"/>
-                <w:sz w:val="20"/>
+                <w:sz w:val="18"/>
               </w:rPr>
               <w:t>Параметр</w:t>
             </w:r>
@@ -232,14 +240,18 @@
             <w:tcW w:type="dxa" w:w="6236"/>
             <w:shd w:fill="1F4E78"/>
             <w:vAlign w:val="center"/>
+            <w:shd w:fill="1F4E78"/>
           </w:tcPr>
           <w:p>
+            <w:pPr>
+              <w:spacing w:after="40"/>
+            </w:pPr>
             <w:r>
               <w:rPr>
-                <w:rFonts w:ascii="Times New Roman" w:hAnsi="Times New Roman" w:eastAsia="Times New Roman"/>
+                <w:rFonts w:ascii="Arial" w:hAnsi="Arial" w:eastAsia="Times New Roman"/>
                 <w:b/>
                 <w:color w:val="FFFFFF"/>
-                <w:sz w:val="20"/>
+                <w:sz w:val="18"/>
               </w:rPr>
               <w:t>Значення</w:t>
             </w:r>
@@ -258,7 +270,7 @@
             </w:pPr>
             <w:r>
               <w:rPr>
-                <w:rFonts w:ascii="Times New Roman" w:hAnsi="Times New Roman" w:eastAsia="Times New Roman"/>
+                <w:rFonts w:ascii="Arial" w:hAnsi="Arial" w:eastAsia="Times New Roman"/>
                 <w:b w:val="0"/>
                 <w:color w:val="000000"/>
                 <w:sz w:val="18"/>
@@ -278,7 +290,7 @@
             </w:pPr>
             <w:r>
               <w:rPr>
-                <w:rFonts w:ascii="Times New Roman" w:hAnsi="Times New Roman" w:eastAsia="Times New Roman"/>
+                <w:rFonts w:ascii="Arial" w:hAnsi="Arial" w:eastAsia="Times New Roman"/>
                 <w:b w:val="0"/>
                 <w:color w:val="000000"/>
                 <w:sz w:val="18"/>
@@ -294,6 +306,7 @@
             <w:tcW w:type="dxa" w:w="2835"/>
             <w:vAlign w:val="center"/>
             <w:shd w:fill="EAF2F8"/>
+            <w:shd w:fill="EAF2F8"/>
           </w:tcPr>
           <w:p>
             <w:pPr>
@@ -301,7 +314,7 @@
             </w:pPr>
             <w:r>
               <w:rPr>
-                <w:rFonts w:ascii="Times New Roman" w:hAnsi="Times New Roman" w:eastAsia="Times New Roman"/>
+                <w:rFonts w:ascii="Arial" w:hAnsi="Arial" w:eastAsia="Times New Roman"/>
                 <w:b w:val="0"/>
                 <w:color w:val="000000"/>
                 <w:sz w:val="18"/>
@@ -315,6 +328,7 @@
             <w:tcW w:type="dxa" w:w="6236"/>
             <w:vAlign w:val="center"/>
             <w:shd w:fill="EAF2F8"/>
+            <w:shd w:fill="EAF2F8"/>
           </w:tcPr>
           <w:p>
             <w:pPr>
@@ -322,7 +336,7 @@
             </w:pPr>
             <w:r>
               <w:rPr>
-                <w:rFonts w:ascii="Times New Roman" w:hAnsi="Times New Roman" w:eastAsia="Times New Roman"/>
+                <w:rFonts w:ascii="Arial" w:hAnsi="Arial" w:eastAsia="Times New Roman"/>
                 <w:b w:val="0"/>
                 <w:color w:val="000000"/>
                 <w:sz w:val="18"/>
@@ -344,7 +358,7 @@
             </w:pPr>
             <w:r>
               <w:rPr>
-                <w:rFonts w:ascii="Times New Roman" w:hAnsi="Times New Roman" w:eastAsia="Times New Roman"/>
+                <w:rFonts w:ascii="Arial" w:hAnsi="Arial" w:eastAsia="Times New Roman"/>
                 <w:b w:val="0"/>
                 <w:color w:val="000000"/>
                 <w:sz w:val="18"/>
@@ -364,7 +378,7 @@
             </w:pPr>
             <w:r>
               <w:rPr>
-                <w:rFonts w:ascii="Times New Roman" w:hAnsi="Times New Roman" w:eastAsia="Times New Roman"/>
+                <w:rFonts w:ascii="Arial" w:hAnsi="Arial" w:eastAsia="Times New Roman"/>
                 <w:b w:val="0"/>
                 <w:color w:val="000000"/>
                 <w:sz w:val="18"/>
@@ -380,6 +394,7 @@
             <w:tcW w:type="dxa" w:w="2835"/>
             <w:vAlign w:val="center"/>
             <w:shd w:fill="EAF2F8"/>
+            <w:shd w:fill="EAF2F8"/>
           </w:tcPr>
           <w:p>
             <w:pPr>
@@ -387,7 +402,7 @@
             </w:pPr>
             <w:r>
               <w:rPr>
-                <w:rFonts w:ascii="Times New Roman" w:hAnsi="Times New Roman" w:eastAsia="Times New Roman"/>
+                <w:rFonts w:ascii="Arial" w:hAnsi="Arial" w:eastAsia="Times New Roman"/>
                 <w:b w:val="0"/>
                 <w:color w:val="000000"/>
                 <w:sz w:val="18"/>
@@ -401,6 +416,7 @@
             <w:tcW w:type="dxa" w:w="6236"/>
             <w:vAlign w:val="center"/>
             <w:shd w:fill="EAF2F8"/>
+            <w:shd w:fill="EAF2F8"/>
           </w:tcPr>
           <w:p>
             <w:pPr>
@@ -408,7 +424,7 @@
             </w:pPr>
             <w:r>
               <w:rPr>
-                <w:rFonts w:ascii="Times New Roman" w:hAnsi="Times New Roman" w:eastAsia="Times New Roman"/>
+                <w:rFonts w:ascii="Arial" w:hAnsi="Arial" w:eastAsia="Times New Roman"/>
                 <w:b w:val="0"/>
                 <w:color w:val="000000"/>
                 <w:sz w:val="18"/>
@@ -430,7 +446,7 @@
             </w:pPr>
             <w:r>
               <w:rPr>
-                <w:rFonts w:ascii="Times New Roman" w:hAnsi="Times New Roman" w:eastAsia="Times New Roman"/>
+                <w:rFonts w:ascii="Arial" w:hAnsi="Arial" w:eastAsia="Times New Roman"/>
                 <w:b w:val="0"/>
                 <w:color w:val="000000"/>
                 <w:sz w:val="18"/>
@@ -450,7 +466,7 @@
             </w:pPr>
             <w:r>
               <w:rPr>
-                <w:rFonts w:ascii="Times New Roman" w:hAnsi="Times New Roman" w:eastAsia="Times New Roman"/>
+                <w:rFonts w:ascii="Arial" w:hAnsi="Arial" w:eastAsia="Times New Roman"/>
                 <w:b w:val="0"/>
                 <w:color w:val="000000"/>
                 <w:sz w:val="18"/>
@@ -466,6 +482,7 @@
             <w:tcW w:type="dxa" w:w="2835"/>
             <w:vAlign w:val="center"/>
             <w:shd w:fill="EAF2F8"/>
+            <w:shd w:fill="EAF2F8"/>
           </w:tcPr>
           <w:p>
             <w:pPr>
@@ -473,7 +490,7 @@
             </w:pPr>
             <w:r>
               <w:rPr>
-                <w:rFonts w:ascii="Times New Roman" w:hAnsi="Times New Roman" w:eastAsia="Times New Roman"/>
+                <w:rFonts w:ascii="Arial" w:hAnsi="Arial" w:eastAsia="Times New Roman"/>
                 <w:b w:val="0"/>
                 <w:color w:val="000000"/>
                 <w:sz w:val="18"/>
@@ -487,6 +504,7 @@
             <w:tcW w:type="dxa" w:w="6236"/>
             <w:vAlign w:val="center"/>
             <w:shd w:fill="EAF2F8"/>
+            <w:shd w:fill="EAF2F8"/>
           </w:tcPr>
           <w:p>
             <w:pPr>
@@ -494,7 +512,7 @@
             </w:pPr>
             <w:r>
               <w:rPr>
-                <w:rFonts w:ascii="Times New Roman" w:hAnsi="Times New Roman" w:eastAsia="Times New Roman"/>
+                <w:rFonts w:ascii="Arial" w:hAnsi="Arial" w:eastAsia="Times New Roman"/>
                 <w:b w:val="0"/>
                 <w:color w:val="000000"/>
                 <w:sz w:val="18"/>
@@ -602,6 +620,7 @@
     </w:p>
     <w:tbl>
       <w:tblPr>
+        <w:tblStyle w:val="TableGrid"/>
         <w:tblW w:type="auto" w:w="0"/>
         <w:jc w:val="center"/>
         <w:tblLook w:firstColumn="1" w:firstRow="1" w:lastColumn="0" w:lastRow="0" w:noHBand="0" w:noVBand="1" w:val="04A0"/>
@@ -621,19 +640,26 @@
         <w:gridCol w:w="2339"/>
       </w:tblGrid>
       <w:tr>
+        <w:trPr>
+          <w:tblHeader/>
+        </w:trPr>
         <w:tc>
           <w:tcPr>
             <w:tcW w:type="dxa" w:w="2551"/>
             <w:shd w:fill="1F4E78"/>
             <w:vAlign w:val="center"/>
+            <w:shd w:fill="1F4E78"/>
           </w:tcPr>
           <w:p>
+            <w:pPr>
+              <w:spacing w:after="40"/>
+            </w:pPr>
             <w:r>
               <w:rPr>
-                <w:rFonts w:ascii="Times New Roman" w:hAnsi="Times New Roman" w:eastAsia="Times New Roman"/>
+                <w:rFonts w:ascii="Arial" w:hAnsi="Arial" w:eastAsia="Times New Roman"/>
                 <w:b/>
                 <w:color w:val="FFFFFF"/>
-                <w:sz w:val="20"/>
+                <w:sz w:val="18"/>
               </w:rPr>
               <w:t>Фактичний клас</w:t>
             </w:r>
@@ -644,14 +670,18 @@
             <w:tcW w:type="dxa" w:w="1984"/>
             <w:shd w:fill="1F4E78"/>
             <w:vAlign w:val="center"/>
+            <w:shd w:fill="1F4E78"/>
           </w:tcPr>
           <w:p>
+            <w:pPr>
+              <w:spacing w:after="40"/>
+            </w:pPr>
             <w:r>
               <w:rPr>
-                <w:rFonts w:ascii="Times New Roman" w:hAnsi="Times New Roman" w:eastAsia="Times New Roman"/>
+                <w:rFonts w:ascii="Arial" w:hAnsi="Arial" w:eastAsia="Times New Roman"/>
                 <w:b/>
                 <w:color w:val="FFFFFF"/>
-                <w:sz w:val="20"/>
+                <w:sz w:val="18"/>
               </w:rPr>
               <w:t>REST</w:t>
             </w:r>
@@ -662,14 +692,18 @@
             <w:tcW w:type="dxa" w:w="1984"/>
             <w:shd w:fill="1F4E78"/>
             <w:vAlign w:val="center"/>
+            <w:shd w:fill="1F4E78"/>
           </w:tcPr>
           <w:p>
+            <w:pPr>
+              <w:spacing w:after="40"/>
+            </w:pPr>
             <w:r>
               <w:rPr>
-                <w:rFonts w:ascii="Times New Roman" w:hAnsi="Times New Roman" w:eastAsia="Times New Roman"/>
+                <w:rFonts w:ascii="Arial" w:hAnsi="Arial" w:eastAsia="Times New Roman"/>
                 <w:b/>
                 <w:color w:val="FFFFFF"/>
-                <w:sz w:val="20"/>
+                <w:sz w:val="18"/>
               </w:rPr>
               <w:t>RESTLESS</w:t>
             </w:r>
@@ -680,14 +714,18 @@
             <w:tcW w:type="dxa" w:w="1984"/>
             <w:shd w:fill="1F4E78"/>
             <w:vAlign w:val="center"/>
+            <w:shd w:fill="1F4E78"/>
           </w:tcPr>
           <w:p>
+            <w:pPr>
+              <w:spacing w:after="40"/>
+            </w:pPr>
             <w:r>
               <w:rPr>
-                <w:rFonts w:ascii="Times New Roman" w:hAnsi="Times New Roman" w:eastAsia="Times New Roman"/>
+                <w:rFonts w:ascii="Arial" w:hAnsi="Arial" w:eastAsia="Times New Roman"/>
                 <w:b/>
                 <w:color w:val="FFFFFF"/>
-                <w:sz w:val="20"/>
+                <w:sz w:val="18"/>
               </w:rPr>
               <w:t>ACTIVE</w:t>
             </w:r>
@@ -706,7 +744,7 @@
             </w:pPr>
             <w:r>
               <w:rPr>
-                <w:rFonts w:ascii="Times New Roman" w:hAnsi="Times New Roman" w:eastAsia="Times New Roman"/>
+                <w:rFonts w:ascii="Arial" w:hAnsi="Arial" w:eastAsia="Times New Roman"/>
                 <w:b w:val="0"/>
                 <w:color w:val="000000"/>
                 <w:sz w:val="18"/>
@@ -726,7 +764,7 @@
             </w:pPr>
             <w:r>
               <w:rPr>
-                <w:rFonts w:ascii="Times New Roman" w:hAnsi="Times New Roman" w:eastAsia="Times New Roman"/>
+                <w:rFonts w:ascii="Arial" w:hAnsi="Arial" w:eastAsia="Times New Roman"/>
                 <w:b w:val="0"/>
                 <w:color w:val="000000"/>
                 <w:sz w:val="18"/>
@@ -746,7 +784,7 @@
             </w:pPr>
             <w:r>
               <w:rPr>
-                <w:rFonts w:ascii="Times New Roman" w:hAnsi="Times New Roman" w:eastAsia="Times New Roman"/>
+                <w:rFonts w:ascii="Arial" w:hAnsi="Arial" w:eastAsia="Times New Roman"/>
                 <w:b w:val="0"/>
                 <w:color w:val="000000"/>
                 <w:sz w:val="18"/>
@@ -766,7 +804,7 @@
             </w:pPr>
             <w:r>
               <w:rPr>
-                <w:rFonts w:ascii="Times New Roman" w:hAnsi="Times New Roman" w:eastAsia="Times New Roman"/>
+                <w:rFonts w:ascii="Arial" w:hAnsi="Arial" w:eastAsia="Times New Roman"/>
                 <w:b w:val="0"/>
                 <w:color w:val="000000"/>
                 <w:sz w:val="18"/>
@@ -782,6 +820,7 @@
             <w:tcW w:type="dxa" w:w="2551"/>
             <w:vAlign w:val="center"/>
             <w:shd w:fill="EAF2F8"/>
+            <w:shd w:fill="EAF2F8"/>
           </w:tcPr>
           <w:p>
             <w:pPr>
@@ -789,7 +828,7 @@
             </w:pPr>
             <w:r>
               <w:rPr>
-                <w:rFonts w:ascii="Times New Roman" w:hAnsi="Times New Roman" w:eastAsia="Times New Roman"/>
+                <w:rFonts w:ascii="Arial" w:hAnsi="Arial" w:eastAsia="Times New Roman"/>
                 <w:b w:val="0"/>
                 <w:color w:val="000000"/>
                 <w:sz w:val="18"/>
@@ -803,6 +842,7 @@
             <w:tcW w:type="dxa" w:w="1984"/>
             <w:vAlign w:val="center"/>
             <w:shd w:fill="EAF2F8"/>
+            <w:shd w:fill="EAF2F8"/>
           </w:tcPr>
           <w:p>
             <w:pPr>
@@ -810,7 +850,7 @@
             </w:pPr>
             <w:r>
               <w:rPr>
-                <w:rFonts w:ascii="Times New Roman" w:hAnsi="Times New Roman" w:eastAsia="Times New Roman"/>
+                <w:rFonts w:ascii="Arial" w:hAnsi="Arial" w:eastAsia="Times New Roman"/>
                 <w:b w:val="0"/>
                 <w:color w:val="000000"/>
                 <w:sz w:val="18"/>
@@ -824,6 +864,7 @@
             <w:tcW w:type="dxa" w:w="1984"/>
             <w:vAlign w:val="center"/>
             <w:shd w:fill="EAF2F8"/>
+            <w:shd w:fill="EAF2F8"/>
           </w:tcPr>
           <w:p>
             <w:pPr>
@@ -831,7 +872,7 @@
             </w:pPr>
             <w:r>
               <w:rPr>
-                <w:rFonts w:ascii="Times New Roman" w:hAnsi="Times New Roman" w:eastAsia="Times New Roman"/>
+                <w:rFonts w:ascii="Arial" w:hAnsi="Arial" w:eastAsia="Times New Roman"/>
                 <w:b w:val="0"/>
                 <w:color w:val="000000"/>
                 <w:sz w:val="18"/>
@@ -845,6 +886,7 @@
             <w:tcW w:type="dxa" w:w="1984"/>
             <w:vAlign w:val="center"/>
             <w:shd w:fill="EAF2F8"/>
+            <w:shd w:fill="EAF2F8"/>
           </w:tcPr>
           <w:p>
             <w:pPr>
@@ -852,7 +894,7 @@
             </w:pPr>
             <w:r>
               <w:rPr>
-                <w:rFonts w:ascii="Times New Roman" w:hAnsi="Times New Roman" w:eastAsia="Times New Roman"/>
+                <w:rFonts w:ascii="Arial" w:hAnsi="Arial" w:eastAsia="Times New Roman"/>
                 <w:b w:val="0"/>
                 <w:color w:val="000000"/>
                 <w:sz w:val="18"/>
@@ -874,7 +916,7 @@
             </w:pPr>
             <w:r>
               <w:rPr>
-                <w:rFonts w:ascii="Times New Roman" w:hAnsi="Times New Roman" w:eastAsia="Times New Roman"/>
+                <w:rFonts w:ascii="Arial" w:hAnsi="Arial" w:eastAsia="Times New Roman"/>
                 <w:b w:val="0"/>
                 <w:color w:val="000000"/>
                 <w:sz w:val="18"/>
@@ -894,7 +936,7 @@
             </w:pPr>
             <w:r>
               <w:rPr>
-                <w:rFonts w:ascii="Times New Roman" w:hAnsi="Times New Roman" w:eastAsia="Times New Roman"/>
+                <w:rFonts w:ascii="Arial" w:hAnsi="Arial" w:eastAsia="Times New Roman"/>
                 <w:b w:val="0"/>
                 <w:color w:val="000000"/>
                 <w:sz w:val="18"/>
@@ -914,7 +956,7 @@
             </w:pPr>
             <w:r>
               <w:rPr>
-                <w:rFonts w:ascii="Times New Roman" w:hAnsi="Times New Roman" w:eastAsia="Times New Roman"/>
+                <w:rFonts w:ascii="Arial" w:hAnsi="Arial" w:eastAsia="Times New Roman"/>
                 <w:b w:val="0"/>
                 <w:color w:val="000000"/>
                 <w:sz w:val="18"/>
@@ -934,7 +976,7 @@
             </w:pPr>
             <w:r>
               <w:rPr>
-                <w:rFonts w:ascii="Times New Roman" w:hAnsi="Times New Roman" w:eastAsia="Times New Roman"/>
+                <w:rFonts w:ascii="Arial" w:hAnsi="Arial" w:eastAsia="Times New Roman"/>
                 <w:b w:val="0"/>
                 <w:color w:val="000000"/>
                 <w:sz w:val="18"/>
@@ -961,13 +1003,7 @@
         <w:jc w:val="both"/>
       </w:pPr>
       <w:r>
-        <w:rPr>
-          <w:rFonts w:ascii="Times New Roman" w:hAnsi="Times New Roman" w:eastAsia="Times New Roman"/>
-          <w:b w:val="0"/>
-          <w:color w:val="000000"/>
-          <w:sz w:val="28"/>
-        </w:rPr>
-        <w:t>ActivityClassifier завантажує asset один раз, перевіряє форми тензорів і відповідність labels. SensorWindowBuffer повертає хронологічне rolling window. MlViewModel запускає inference через Dispatchers.Default і закриває Interpreter у onCleared.</w:t>
+        <w:t>ActivityClassifier завантажує asset один раз, перевіряє float32 tensor contract [1,20,3] → [1,3], порядок REST, RESTLESS, ACTIVE та нормалізацію probabilities. Mean centering виконується всередині графа, тому Android передає raw XYZ без дублювання preprocessing.</w:t>
       </w:r>
     </w:p>
     <w:p>
@@ -976,44 +1012,7 @@
         <w:ind w:left="340"/>
       </w:pPr>
       <w:r>
-        <w:rPr>
-          <w:rFonts w:ascii="Consolas" w:hAnsi="Consolas" w:eastAsia="Consolas"/>
-          <w:b w:val="0"/>
-          <w:color w:val="000000"/>
-          <w:sz w:val="18"/>
-        </w:rPr>
-        <w:t>val window = buffer.add(sample) ?: return</w:t>
-        <w:br/>
-      </w:r>
-      <w:r>
-        <w:rPr>
-          <w:rFonts w:ascii="Consolas" w:hAnsi="Consolas" w:eastAsia="Consolas"/>
-          <w:b w:val="0"/>
-          <w:color w:val="000000"/>
-          <w:sz w:val="18"/>
-        </w:rPr>
-        <w:t>val prediction = withContext(Dispatchers.Default) {</w:t>
-        <w:br/>
-      </w:r>
-      <w:r>
-        <w:rPr>
-          <w:rFonts w:ascii="Consolas" w:hAnsi="Consolas" w:eastAsia="Consolas"/>
-          <w:b w:val="0"/>
-          <w:color w:val="000000"/>
-          <w:sz w:val="18"/>
-        </w:rPr>
-        <w:t xml:space="preserve">    classifier.classify(window)</w:t>
-        <w:br/>
-      </w:r>
-      <w:r>
-        <w:rPr>
-          <w:rFonts w:ascii="Consolas" w:hAnsi="Consolas" w:eastAsia="Consolas"/>
-          <w:b w:val="0"/>
-          <w:color w:val="000000"/>
-          <w:sz w:val="18"/>
-        </w:rPr>
-        <w:t>}</w:t>
-        <w:br/>
+        <w:t>MlViewModel приймає впорядковані samples через SharedFlow, відкидає non-monotonic timestamps і sampling gaps понад 100 ms, формує bounded latest window та виконує inference одним послідовним consumer на Dispatchers.Default. CancellationException не перетворюється на помилку, Interpreter закривається в onCleared.</w:t>
       </w:r>
     </w:p>
     <w:p>
@@ -1050,6 +1049,7 @@
     </w:p>
     <w:tbl>
       <w:tblPr>
+        <w:tblStyle w:val="TableGrid"/>
         <w:tblW w:type="auto" w:w="0"/>
         <w:jc w:val="center"/>
         <w:tblLook w:firstColumn="1" w:firstRow="1" w:lastColumn="0" w:lastRow="0" w:noHBand="0" w:noVBand="1" w:val="04A0"/>
@@ -1068,19 +1068,26 @@
         <w:gridCol w:w="3118"/>
       </w:tblGrid>
       <w:tr>
+        <w:trPr>
+          <w:tblHeader/>
+        </w:trPr>
         <w:tc>
           <w:tcPr>
             <w:tcW w:type="dxa" w:w="1134"/>
             <w:shd w:fill="1F4E78"/>
             <w:vAlign w:val="center"/>
+            <w:shd w:fill="1F4E78"/>
           </w:tcPr>
           <w:p>
+            <w:pPr>
+              <w:spacing w:after="40"/>
+            </w:pPr>
             <w:r>
               <w:rPr>
-                <w:rFonts w:ascii="Times New Roman" w:hAnsi="Times New Roman" w:eastAsia="Times New Roman"/>
+                <w:rFonts w:ascii="Arial" w:hAnsi="Arial" w:eastAsia="Times New Roman"/>
                 <w:b/>
                 <w:color w:val="FFFFFF"/>
-                <w:sz w:val="20"/>
+                <w:sz w:val="18"/>
               </w:rPr>
               <w:t>ID</w:t>
             </w:r>
@@ -1091,14 +1098,18 @@
             <w:tcW w:type="dxa" w:w="4535"/>
             <w:shd w:fill="1F4E78"/>
             <w:vAlign w:val="center"/>
+            <w:shd w:fill="1F4E78"/>
           </w:tcPr>
           <w:p>
+            <w:pPr>
+              <w:spacing w:after="40"/>
+            </w:pPr>
             <w:r>
               <w:rPr>
-                <w:rFonts w:ascii="Times New Roman" w:hAnsi="Times New Roman" w:eastAsia="Times New Roman"/>
+                <w:rFonts w:ascii="Arial" w:hAnsi="Arial" w:eastAsia="Times New Roman"/>
                 <w:b/>
                 <w:color w:val="FFFFFF"/>
-                <w:sz w:val="20"/>
+                <w:sz w:val="18"/>
               </w:rPr>
               <w:t>Перевірка</w:t>
             </w:r>
@@ -1109,14 +1120,18 @@
             <w:tcW w:type="dxa" w:w="3402"/>
             <w:shd w:fill="1F4E78"/>
             <w:vAlign w:val="center"/>
+            <w:shd w:fill="1F4E78"/>
           </w:tcPr>
           <w:p>
+            <w:pPr>
+              <w:spacing w:after="40"/>
+            </w:pPr>
             <w:r>
               <w:rPr>
-                <w:rFonts w:ascii="Times New Roman" w:hAnsi="Times New Roman" w:eastAsia="Times New Roman"/>
+                <w:rFonts w:ascii="Arial" w:hAnsi="Arial" w:eastAsia="Times New Roman"/>
                 <w:b/>
                 <w:color w:val="FFFFFF"/>
-                <w:sz w:val="20"/>
+                <w:sz w:val="18"/>
               </w:rPr>
               <w:t>Результат</w:t>
             </w:r>
@@ -1135,7 +1150,7 @@
             </w:pPr>
             <w:r>
               <w:rPr>
-                <w:rFonts w:ascii="Times New Roman" w:hAnsi="Times New Roman" w:eastAsia="Times New Roman"/>
+                <w:rFonts w:ascii="Arial" w:hAnsi="Arial" w:eastAsia="Times New Roman"/>
                 <w:b w:val="0"/>
                 <w:color w:val="000000"/>
                 <w:sz w:val="18"/>
@@ -1155,7 +1170,7 @@
             </w:pPr>
             <w:r>
               <w:rPr>
-                <w:rFonts w:ascii="Times New Roman" w:hAnsi="Times New Roman" w:eastAsia="Times New Roman"/>
+                <w:rFonts w:ascii="Arial" w:hAnsi="Arial" w:eastAsia="Times New Roman"/>
                 <w:b w:val="0"/>
                 <w:color w:val="000000"/>
                 <w:sz w:val="18"/>
@@ -1175,7 +1190,7 @@
             </w:pPr>
             <w:r>
               <w:rPr>
-                <w:rFonts w:ascii="Times New Roman" w:hAnsi="Times New Roman" w:eastAsia="Times New Roman"/>
+                <w:rFonts w:ascii="Arial" w:hAnsi="Arial" w:eastAsia="Times New Roman"/>
                 <w:b w:val="0"/>
                 <w:color w:val="000000"/>
                 <w:sz w:val="18"/>
@@ -1191,6 +1206,7 @@
             <w:tcW w:type="dxa" w:w="1134"/>
             <w:vAlign w:val="center"/>
             <w:shd w:fill="EAF2F8"/>
+            <w:shd w:fill="EAF2F8"/>
           </w:tcPr>
           <w:p>
             <w:pPr>
@@ -1198,7 +1214,7 @@
             </w:pPr>
             <w:r>
               <w:rPr>
-                <w:rFonts w:ascii="Times New Roman" w:hAnsi="Times New Roman" w:eastAsia="Times New Roman"/>
+                <w:rFonts w:ascii="Arial" w:hAnsi="Arial" w:eastAsia="Times New Roman"/>
                 <w:b w:val="0"/>
                 <w:color w:val="000000"/>
                 <w:sz w:val="18"/>
@@ -1212,6 +1228,7 @@
             <w:tcW w:type="dxa" w:w="4535"/>
             <w:vAlign w:val="center"/>
             <w:shd w:fill="EAF2F8"/>
+            <w:shd w:fill="EAF2F8"/>
           </w:tcPr>
           <w:p>
             <w:pPr>
@@ -1219,7 +1236,7 @@
             </w:pPr>
             <w:r>
               <w:rPr>
-                <w:rFonts w:ascii="Times New Roman" w:hAnsi="Times New Roman" w:eastAsia="Times New Roman"/>
+                <w:rFonts w:ascii="Arial" w:hAnsi="Arial" w:eastAsia="Times New Roman"/>
                 <w:b w:val="0"/>
                 <w:color w:val="000000"/>
                 <w:sz w:val="18"/>
@@ -1233,6 +1250,7 @@
             <w:tcW w:type="dxa" w:w="3402"/>
             <w:vAlign w:val="center"/>
             <w:shd w:fill="EAF2F8"/>
+            <w:shd w:fill="EAF2F8"/>
           </w:tcPr>
           <w:p>
             <w:pPr>
@@ -1240,7 +1258,7 @@
             </w:pPr>
             <w:r>
               <w:rPr>
-                <w:rFonts w:ascii="Times New Roman" w:hAnsi="Times New Roman" w:eastAsia="Times New Roman"/>
+                <w:rFonts w:ascii="Arial" w:hAnsi="Arial" w:eastAsia="Times New Roman"/>
                 <w:b w:val="0"/>
                 <w:color w:val="000000"/>
                 <w:sz w:val="18"/>
@@ -1262,7 +1280,7 @@
             </w:pPr>
             <w:r>
               <w:rPr>
-                <w:rFonts w:ascii="Times New Roman" w:hAnsi="Times New Roman" w:eastAsia="Times New Roman"/>
+                <w:rFonts w:ascii="Arial" w:hAnsi="Arial" w:eastAsia="Times New Roman"/>
                 <w:b w:val="0"/>
                 <w:color w:val="000000"/>
                 <w:sz w:val="18"/>
@@ -1282,7 +1300,7 @@
             </w:pPr>
             <w:r>
               <w:rPr>
-                <w:rFonts w:ascii="Times New Roman" w:hAnsi="Times New Roman" w:eastAsia="Times New Roman"/>
+                <w:rFonts w:ascii="Arial" w:hAnsi="Arial" w:eastAsia="Times New Roman"/>
                 <w:b w:val="0"/>
                 <w:color w:val="000000"/>
                 <w:sz w:val="18"/>
@@ -1302,7 +1320,7 @@
             </w:pPr>
             <w:r>
               <w:rPr>
-                <w:rFonts w:ascii="Times New Roman" w:hAnsi="Times New Roman" w:eastAsia="Times New Roman"/>
+                <w:rFonts w:ascii="Arial" w:hAnsi="Arial" w:eastAsia="Times New Roman"/>
                 <w:b w:val="0"/>
                 <w:color w:val="000000"/>
                 <w:sz w:val="18"/>
@@ -1318,6 +1336,7 @@
             <w:tcW w:type="dxa" w:w="1134"/>
             <w:vAlign w:val="center"/>
             <w:shd w:fill="EAF2F8"/>
+            <w:shd w:fill="EAF2F8"/>
           </w:tcPr>
           <w:p>
             <w:pPr>
@@ -1325,7 +1344,7 @@
             </w:pPr>
             <w:r>
               <w:rPr>
-                <w:rFonts w:ascii="Times New Roman" w:hAnsi="Times New Roman" w:eastAsia="Times New Roman"/>
+                <w:rFonts w:ascii="Arial" w:hAnsi="Arial" w:eastAsia="Times New Roman"/>
                 <w:b w:val="0"/>
                 <w:color w:val="000000"/>
                 <w:sz w:val="18"/>
@@ -1339,6 +1358,7 @@
             <w:tcW w:type="dxa" w:w="4535"/>
             <w:vAlign w:val="center"/>
             <w:shd w:fill="EAF2F8"/>
+            <w:shd w:fill="EAF2F8"/>
           </w:tcPr>
           <w:p>
             <w:pPr>
@@ -1346,7 +1366,7 @@
             </w:pPr>
             <w:r>
               <w:rPr>
-                <w:rFonts w:ascii="Times New Roman" w:hAnsi="Times New Roman" w:eastAsia="Times New Roman"/>
+                <w:rFonts w:ascii="Arial" w:hAnsi="Arial" w:eastAsia="Times New Roman"/>
                 <w:b w:val="0"/>
                 <w:color w:val="000000"/>
                 <w:sz w:val="18"/>
@@ -1360,6 +1380,7 @@
             <w:tcW w:type="dxa" w:w="3402"/>
             <w:vAlign w:val="center"/>
             <w:shd w:fill="EAF2F8"/>
+            <w:shd w:fill="EAF2F8"/>
           </w:tcPr>
           <w:p>
             <w:pPr>
@@ -1367,12 +1388,68 @@
             </w:pPr>
             <w:r>
               <w:rPr>
-                <w:rFonts w:ascii="Times New Roman" w:hAnsi="Times New Roman" w:eastAsia="Times New Roman"/>
+                <w:rFonts w:ascii="Arial" w:hAnsi="Arial" w:eastAsia="Times New Roman"/>
                 <w:b w:val="0"/>
                 <w:color w:val="000000"/>
                 <w:sz w:val="18"/>
               </w:rPr>
               <w:t>Потребує ручних screenshots</w:t>
+            </w:r>
+          </w:p>
+        </w:tc>
+      </w:tr>
+      <w:tr>
+        <w:tc>
+          <w:tcPr>
+            <w:tcW w:type="dxa" w:w="3118"/>
+            <w:vAlign w:val="center"/>
+          </w:tcPr>
+          <w:p>
+            <w:pPr>
+              <w:spacing w:after="40"/>
+            </w:pPr>
+            <w:r>
+              <w:rPr>
+                <w:rFonts w:ascii="Arial" w:hAnsi="Arial"/>
+                <w:sz w:val="18"/>
+              </w:rPr>
+              <w:t>ML-05</w:t>
+            </w:r>
+          </w:p>
+        </w:tc>
+        <w:tc>
+          <w:tcPr>
+            <w:tcW w:type="dxa" w:w="3118"/>
+            <w:vAlign w:val="center"/>
+          </w:tcPr>
+          <w:p>
+            <w:pPr>
+              <w:spacing w:after="40"/>
+            </w:pPr>
+            <w:r>
+              <w:rPr>
+                <w:rFonts w:ascii="Arial" w:hAnsi="Arial"/>
+                <w:sz w:val="18"/>
+              </w:rPr>
+              <w:t>Python та Android TFLite golden parity</w:t>
+            </w:r>
+          </w:p>
+        </w:tc>
+        <w:tc>
+          <w:tcPr>
+            <w:tcW w:type="dxa" w:w="3118"/>
+            <w:vAlign w:val="center"/>
+          </w:tcPr>
+          <w:p>
+            <w:pPr>
+              <w:spacing w:after="40"/>
+            </w:pPr>
+            <w:r>
+              <w:rPr>
+                <w:rFonts w:ascii="Arial" w:hAnsi="Arial"/>
+                <w:sz w:val="18"/>
+              </w:rPr>
+              <w:t>PASS, API 36, tolerance 1e-5</w:t>
             </w:r>
           </w:p>
         </w:tc>
@@ -1418,18 +1495,362 @@
         <w:jc w:val="both"/>
       </w:pPr>
       <w:r>
-        <w:rPr>
-          <w:rFonts w:ascii="Times New Roman" w:hAnsi="Times New Roman" w:eastAsia="Times New Roman"/>
-          <w:b w:val="0"/>
-          <w:color w:val="000000"/>
-          <w:sz w:val="28"/>
-        </w:rPr>
-        <w:t>Реалізовано справжній локальний TFLite inference з фіксованим контрактом тензорів, кільцевим буфером і керованим життєвим циклом. Основне обмеження — синтетичні дані; для практичного використання потрібен реальний датасет і валідація на різних пристроях.</w:t>
+        <w:t>Реалізовано локальний TFLite inference з перевіреним tensor contract, контрольованим sampling, bounded window і керованим життєвим циклом. Python TFLite та Android TFLite дали однакові probabilities для golden vector з tolerance 1e-5. Модель навчена лише на синтетичних даних, тому 97,22% не є показником клінічної або польової точності.</w:t>
+      </w:r>
+    </w:p>
+    <w:p>
+      <w:pPr>
+        <w:pStyle w:val="Heading1"/>
+      </w:pPr>
+      <w:r>
+        <w:t>11 Фінальна приймальна перевірка</w:t>
+      </w:r>
+    </w:p>
+    <w:p>
+      <w:pPr>
+        <w:spacing w:after="160"/>
+      </w:pPr>
+      <w:r>
+        <w:t>Фінальна перевірка виконана 20 жовтня 2026 року на Pixel_10_Pro AVD з Android API 36. Наведені нижче результати походять із фактичних локальних запусків, а не з припущень за кодом.</w:t>
+      </w:r>
+    </w:p>
+    <w:tbl>
+      <w:tblPr>
+        <w:tblStyle w:val="TableGrid"/>
+        <w:tblW w:type="auto" w:w="0"/>
+        <w:tblLook w:firstColumn="1" w:firstRow="1" w:lastColumn="0" w:lastRow="0" w:noHBand="0" w:noVBand="1" w:val="04A0"/>
+      </w:tblPr>
+      <w:tblGrid>
+        <w:gridCol w:w="3118"/>
+        <w:gridCol w:w="3118"/>
+        <w:gridCol w:w="3118"/>
+      </w:tblGrid>
+      <w:tr>
+        <w:trPr>
+          <w:tblHeader/>
+        </w:trPr>
+        <w:tc>
+          <w:tcPr>
+            <w:tcW w:type="dxa" w:w="3118"/>
+            <w:vAlign w:val="center"/>
+            <w:shd w:fill="1F4E78"/>
+          </w:tcPr>
+          <w:p>
+            <w:pPr>
+              <w:spacing w:after="40"/>
+            </w:pPr>
+            <w:r>
+              <w:rPr>
+                <w:rFonts w:ascii="Arial" w:hAnsi="Arial"/>
+                <w:b/>
+                <w:color w:val="FFFFFF"/>
+                <w:sz w:val="18"/>
+              </w:rPr>
+              <w:t>Перевірка</w:t>
+            </w:r>
+          </w:p>
+        </w:tc>
+        <w:tc>
+          <w:tcPr>
+            <w:tcW w:type="dxa" w:w="3118"/>
+            <w:vAlign w:val="center"/>
+            <w:shd w:fill="1F4E78"/>
+          </w:tcPr>
+          <w:p>
+            <w:pPr>
+              <w:spacing w:after="40"/>
+            </w:pPr>
+            <w:r>
+              <w:rPr>
+                <w:rFonts w:ascii="Arial" w:hAnsi="Arial"/>
+                <w:b/>
+                <w:color w:val="FFFFFF"/>
+                <w:sz w:val="18"/>
+              </w:rPr>
+              <w:t>Результат</w:t>
+            </w:r>
+          </w:p>
+        </w:tc>
+        <w:tc>
+          <w:tcPr>
+            <w:tcW w:type="dxa" w:w="3118"/>
+            <w:vAlign w:val="center"/>
+            <w:shd w:fill="1F4E78"/>
+          </w:tcPr>
+          <w:p>
+            <w:pPr>
+              <w:spacing w:after="40"/>
+            </w:pPr>
+            <w:r>
+              <w:rPr>
+                <w:rFonts w:ascii="Arial" w:hAnsi="Arial"/>
+                <w:b/>
+                <w:color w:val="FFFFFF"/>
+                <w:sz w:val="18"/>
+              </w:rPr>
+              <w:t>Доказ</w:t>
+            </w:r>
+          </w:p>
+        </w:tc>
+      </w:tr>
+      <w:tr>
+        <w:tc>
+          <w:tcPr>
+            <w:tcW w:type="dxa" w:w="3118"/>
+            <w:vAlign w:val="center"/>
+          </w:tcPr>
+          <w:p>
+            <w:pPr>
+              <w:spacing w:after="40"/>
+            </w:pPr>
+            <w:r>
+              <w:rPr>
+                <w:rFonts w:ascii="Arial" w:hAnsi="Arial"/>
+                <w:sz w:val="18"/>
+              </w:rPr>
+              <w:t>Model SHA-256</w:t>
+            </w:r>
+          </w:p>
+        </w:tc>
+        <w:tc>
+          <w:tcPr>
+            <w:tcW w:type="dxa" w:w="3118"/>
+            <w:vAlign w:val="center"/>
+          </w:tcPr>
+          <w:p>
+            <w:pPr>
+              <w:spacing w:after="40"/>
+            </w:pPr>
+            <w:r>
+              <w:rPr>
+                <w:rFonts w:ascii="Arial" w:hAnsi="Arial"/>
+                <w:sz w:val="18"/>
+              </w:rPr>
+              <w:t>PASS</w:t>
+            </w:r>
+          </w:p>
+        </w:tc>
+        <w:tc>
+          <w:tcPr>
+            <w:tcW w:type="dxa" w:w="3118"/>
+            <w:vAlign w:val="center"/>
+          </w:tcPr>
+          <w:p>
+            <w:pPr>
+              <w:spacing w:after="40"/>
+            </w:pPr>
+            <w:r>
+              <w:rPr>
+                <w:rFonts w:ascii="Arial" w:hAnsi="Arial"/>
+                <w:sz w:val="18"/>
+              </w:rPr>
+              <w:t>Незмінний checked-in activity_classifier.tflite, 11368 байт</w:t>
+            </w:r>
+          </w:p>
+        </w:tc>
+      </w:tr>
+      <w:tr>
+        <w:tc>
+          <w:tcPr>
+            <w:tcW w:type="dxa" w:w="3118"/>
+            <w:vAlign w:val="center"/>
+            <w:shd w:fill="EAF2F8"/>
+          </w:tcPr>
+          <w:p>
+            <w:pPr>
+              <w:spacing w:after="40"/>
+            </w:pPr>
+            <w:r>
+              <w:rPr>
+                <w:rFonts w:ascii="Arial" w:hAnsi="Arial"/>
+                <w:sz w:val="18"/>
+              </w:rPr>
+              <w:t>Tensor contract</w:t>
+            </w:r>
+          </w:p>
+        </w:tc>
+        <w:tc>
+          <w:tcPr>
+            <w:tcW w:type="dxa" w:w="3118"/>
+            <w:vAlign w:val="center"/>
+            <w:shd w:fill="EAF2F8"/>
+          </w:tcPr>
+          <w:p>
+            <w:pPr>
+              <w:spacing w:after="40"/>
+            </w:pPr>
+            <w:r>
+              <w:rPr>
+                <w:rFonts w:ascii="Arial" w:hAnsi="Arial"/>
+                <w:sz w:val="18"/>
+              </w:rPr>
+              <w:t>PASS</w:t>
+            </w:r>
+          </w:p>
+        </w:tc>
+        <w:tc>
+          <w:tcPr>
+            <w:tcW w:type="dxa" w:w="3118"/>
+            <w:vAlign w:val="center"/>
+            <w:shd w:fill="EAF2F8"/>
+          </w:tcPr>
+          <w:p>
+            <w:pPr>
+              <w:spacing w:after="40"/>
+            </w:pPr>
+            <w:r>
+              <w:rPr>
+                <w:rFonts w:ascii="Arial" w:hAnsi="Arial"/>
+                <w:sz w:val="18"/>
+              </w:rPr>
+              <w:t>float32 [1,20,3] → [1,3], REST/RESTLESS/ACTIVE</w:t>
+            </w:r>
+          </w:p>
+        </w:tc>
+      </w:tr>
+      <w:tr>
+        <w:tc>
+          <w:tcPr>
+            <w:tcW w:type="dxa" w:w="3118"/>
+            <w:vAlign w:val="center"/>
+          </w:tcPr>
+          <w:p>
+            <w:pPr>
+              <w:spacing w:after="40"/>
+            </w:pPr>
+            <w:r>
+              <w:rPr>
+                <w:rFonts w:ascii="Arial" w:hAnsi="Arial"/>
+                <w:sz w:val="18"/>
+              </w:rPr>
+              <w:t>Golden parity</w:t>
+            </w:r>
+          </w:p>
+        </w:tc>
+        <w:tc>
+          <w:tcPr>
+            <w:tcW w:type="dxa" w:w="3118"/>
+            <w:vAlign w:val="center"/>
+          </w:tcPr>
+          <w:p>
+            <w:pPr>
+              <w:spacing w:after="40"/>
+            </w:pPr>
+            <w:r>
+              <w:rPr>
+                <w:rFonts w:ascii="Arial" w:hAnsi="Arial"/>
+                <w:sz w:val="18"/>
+              </w:rPr>
+              <w:t>PASS</w:t>
+            </w:r>
+          </w:p>
+        </w:tc>
+        <w:tc>
+          <w:tcPr>
+            <w:tcW w:type="dxa" w:w="3118"/>
+            <w:vAlign w:val="center"/>
+          </w:tcPr>
+          <w:p>
+            <w:pPr>
+              <w:spacing w:after="40"/>
+            </w:pPr>
+            <w:r>
+              <w:rPr>
+                <w:rFonts w:ascii="Arial" w:hAnsi="Arial"/>
+                <w:sz w:val="18"/>
+              </w:rPr>
+              <w:t>Python TFLite проти Android TFLite, absolute error &lt; 1e-5</w:t>
+            </w:r>
+          </w:p>
+        </w:tc>
+      </w:tr>
+      <w:tr>
+        <w:tc>
+          <w:tcPr>
+            <w:tcW w:type="dxa" w:w="3118"/>
+            <w:vAlign w:val="center"/>
+            <w:shd w:fill="EAF2F8"/>
+          </w:tcPr>
+          <w:p>
+            <w:pPr>
+              <w:spacing w:after="40"/>
+            </w:pPr>
+            <w:r>
+              <w:rPr>
+                <w:rFonts w:ascii="Arial" w:hAnsi="Arial"/>
+                <w:sz w:val="18"/>
+              </w:rPr>
+              <w:t>Android instrumentation</w:t>
+            </w:r>
+          </w:p>
+        </w:tc>
+        <w:tc>
+          <w:tcPr>
+            <w:tcW w:type="dxa" w:w="3118"/>
+            <w:vAlign w:val="center"/>
+            <w:shd w:fill="EAF2F8"/>
+          </w:tcPr>
+          <w:p>
+            <w:pPr>
+              <w:spacing w:after="40"/>
+            </w:pPr>
+            <w:r>
+              <w:rPr>
+                <w:rFonts w:ascii="Arial" w:hAnsi="Arial"/>
+                <w:sz w:val="18"/>
+              </w:rPr>
+              <w:t>PASS</w:t>
+            </w:r>
+          </w:p>
+        </w:tc>
+        <w:tc>
+          <w:tcPr>
+            <w:tcW w:type="dxa" w:w="3118"/>
+            <w:vAlign w:val="center"/>
+            <w:shd w:fill="EAF2F8"/>
+          </w:tcPr>
+          <w:p>
+            <w:pPr>
+              <w:spacing w:after="40"/>
+            </w:pPr>
+            <w:r>
+              <w:rPr>
+                <w:rFonts w:ascii="Arial" w:hAnsi="Arial"/>
+                <w:sz w:val="18"/>
+              </w:rPr>
+              <w:t>Реальний TFLite inference на Pixel_10_Pro API 36</w:t>
+            </w:r>
+          </w:p>
+        </w:tc>
+      </w:tr>
+    </w:tbl>
+    <w:p>
+      <w:pPr>
+        <w:pStyle w:val="Heading2"/>
+      </w:pPr>
+      <w:r>
+        <w:t>Обмеження</w:t>
+      </w:r>
+    </w:p>
+    <w:p>
+      <w:pPr>
+        <w:pStyle w:val="ListBullet"/>
+      </w:pPr>
+      <w:r>
+        <w:t>Dataset синтетичний і не репрезентує реальний сон або клінічні стани.</w:t>
+      </w:r>
+    </w:p>
+    <w:p>
+      <w:pPr>
+        <w:pStyle w:val="ListBullet"/>
+      </w:pPr>
+      <w:r>
+        <w:t>Sampling trace на фізичному пристрої та release benchmark не виконані.</w:t>
       </w:r>
     </w:p>
     <w:sectPr>
       <w:pgSz w:w="11906" w:h="16838"/>
-      <w:pgMar w:top="1134" w:right="850" w:bottom="1134" w:left="1701" w:header="720" w:footer="720" w:gutter="0"/>
+      <w:pgMar w:top="1134" w:right="1020" w:bottom="1134" w:left="1247" w:header="720" w:footer="720" w:gutter="0"/>
       <w:cols w:space="720"/>
       <w:docGrid w:linePitch="360"/>
     </w:sectPr>
@@ -2051,7 +2472,7 @@
       <w:outlineLvl w:val="0"/>
     </w:pPr>
     <w:rPr>
-      <w:rFonts w:asciiTheme="majorHAnsi" w:eastAsiaTheme="majorEastAsia" w:hAnsiTheme="majorHAnsi" w:cstheme="majorBidi" w:ascii="Times New Roman" w:hAnsi="Times New Roman"/>
+      <w:rFonts w:asciiTheme="majorHAnsi" w:eastAsiaTheme="majorEastAsia" w:hAnsiTheme="majorHAnsi" w:cstheme="majorBidi" w:ascii="Arial" w:hAnsi="Arial"/>
       <w:b/>
       <w:bCs/>
       <w:color w:val="000000"/>
@@ -2075,7 +2496,7 @@
       <w:outlineLvl w:val="1"/>
     </w:pPr>
     <w:rPr>
-      <w:rFonts w:asciiTheme="majorHAnsi" w:eastAsiaTheme="majorEastAsia" w:hAnsiTheme="majorHAnsi" w:cstheme="majorBidi" w:ascii="Times New Roman" w:hAnsi="Times New Roman"/>
+      <w:rFonts w:asciiTheme="majorHAnsi" w:eastAsiaTheme="majorEastAsia" w:hAnsiTheme="majorHAnsi" w:cstheme="majorBidi" w:ascii="Arial" w:hAnsi="Arial"/>
       <w:b/>
       <w:bCs/>
       <w:color w:val="000000"/>
@@ -2099,10 +2520,10 @@
       <w:outlineLvl w:val="2"/>
     </w:pPr>
     <w:rPr>
-      <w:rFonts w:asciiTheme="majorHAnsi" w:eastAsiaTheme="majorEastAsia" w:hAnsiTheme="majorHAnsi" w:cstheme="majorBidi"/>
+      <w:rFonts w:asciiTheme="majorHAnsi" w:eastAsiaTheme="majorEastAsia" w:hAnsiTheme="majorHAnsi" w:cstheme="majorBidi" w:ascii="Arial" w:hAnsi="Arial"/>
       <w:b/>
       <w:bCs/>
-      <w:color w:val="4F81BD" w:themeColor="accent1"/>
+      <w:color w:val="000000"/>
     </w:rPr>
   </w:style>
   <w:style w:type="paragraph" w:styleId="Heading4">
@@ -2383,7 +2804,7 @@
       <w:contextualSpacing/>
     </w:pPr>
     <w:rPr>
-      <w:rFonts w:asciiTheme="majorHAnsi" w:eastAsiaTheme="majorEastAsia" w:hAnsiTheme="majorHAnsi" w:cstheme="majorBidi" w:ascii="Times New Roman" w:hAnsi="Times New Roman"/>
+      <w:rFonts w:asciiTheme="majorHAnsi" w:eastAsiaTheme="majorEastAsia" w:hAnsiTheme="majorHAnsi" w:cstheme="majorBidi" w:ascii="Arial" w:hAnsi="Arial"/>
       <w:color w:val="000000"/>
       <w:spacing w:val="5"/>
       <w:kern w:val="28"/>

</xml_diff>